<commit_message>
feat: expand nomination workflows and public API
</commit_message>
<xml_diff>
--- a/backend/src/nominations/templates/nomination-instructions.docx
+++ b/backend/src/nominations/templates/nomination-instructions.docx
@@ -5,7 +5,6 @@
     <w:tbl>
       <w:tblPr>
         <w:tblStyle w:val="Tablaconcuadrcula"/>
-        <w:tblpPr w:leftFromText="141" w:rightFromText="141" w:vertAnchor="text" w:horzAnchor="margin" w:tblpXSpec="center" w:tblpYSpec="center"/>
         <w:tblW w:w="10201" w:type="dxa"/>
         <w:tblLayout w:type="fixed"/>
         <w:tblLook w:val="04A0" w:firstRow="1" w:lastRow="0" w:firstColumn="1" w:lastColumn="0" w:noHBand="0" w:noVBand="1"/>
@@ -197,136 +196,16 @@
                 <w:szCs w:val="14"/>
               </w:rPr>
             </w:pPr>
-            <w:hyperlink r:id="rId8" w:history="1">
-              <w:r>
-                <w:rPr>
-                  <w:rStyle w:val="Hipervnculo"/>
-                  <w:rFonts w:ascii="Arial" w:hAnsi="Arial" w:cs="Arial"/>
-                  <w:color w:val="000000" w:themeColor="text1"/>
-                  <w:sz w:val="14"/>
-                  <w:szCs w:val="14"/>
-                  <w:u w:val="none"/>
-                </w:rPr>
-                <w:t xml:space="preserve">{firstMessage}</w:t>
-              </w:r>
-            </w:hyperlink>
-            <w:hyperlink r:id="rId9" w:history="1">
-              <w:r>
-                <w:rPr>
-                  <w:rStyle w:val="Hipervnculo"/>
-                  <w:rFonts w:ascii="Arial" w:hAnsi="Arial" w:cs="Arial"/>
-                  <w:color w:val="000000" w:themeColor="text1"/>
-                  <w:sz w:val="14"/>
-                  <w:szCs w:val="14"/>
-                  <w:u w:val="none"/>
-                </w:rPr>
-                <w:t>yusuke.matsumi@nykgroup.com</w:t>
-              </w:r>
-            </w:hyperlink>
-            <w:hyperlink r:id="rId10" w:tgtFrame="_blank" w:history="1">
-              <w:r>
-                <w:rPr>
-                  <w:rStyle w:val="Hipervnculo"/>
-                  <w:rFonts w:ascii="Arial" w:hAnsi="Arial" w:cs="Arial"/>
-                  <w:color w:val="000000" w:themeColor="text1"/>
-                  <w:sz w:val="14"/>
-                  <w:szCs w:val="14"/>
-                  <w:u w:val="none"/>
-                </w:rPr>
-                <w:t>tsukina.yukimura@nykgroup.com</w:t>
-              </w:r>
-            </w:hyperlink>
-            <w:hyperlink r:id="rId11" w:tgtFrame="_blank" w:history="1">
-              <w:r>
-                <w:rPr>
-                  <w:rStyle w:val="Hipervnculo"/>
-                  <w:rFonts w:ascii="Arial" w:hAnsi="Arial" w:cs="Arial"/>
-                  <w:color w:val="000000" w:themeColor="text1"/>
-                  <w:sz w:val="14"/>
-                  <w:szCs w:val="14"/>
-                  <w:u w:val="none"/>
-                </w:rPr>
-                <w:t>tankcru@nykgroup.com</w:t>
-              </w:r>
-            </w:hyperlink>
-            <w:hyperlink r:id="rId12" w:tgtFrame="_blank" w:history="1">
-              <w:r>
-                <w:rPr>
-                  <w:rStyle w:val="Hipervnculo"/>
-                  <w:rFonts w:ascii="Arial" w:hAnsi="Arial" w:cs="Arial"/>
-                  <w:color w:val="000000" w:themeColor="text1"/>
-                  <w:sz w:val="14"/>
-                  <w:szCs w:val="14"/>
-                  <w:u w:val="none"/>
-                </w:rPr>
-                <w:t>martanker@nykgroup.com</w:t>
-              </w:r>
-            </w:hyperlink>
-            <w:hyperlink r:id="rId13" w:tgtFrame="_blank" w:history="1">
-              <w:r>
-                <w:rPr>
-                  <w:rStyle w:val="Hipervnculo"/>
-                  <w:rFonts w:ascii="Arial" w:hAnsi="Arial" w:cs="Arial"/>
-                  <w:color w:val="000000" w:themeColor="text1"/>
-                  <w:sz w:val="14"/>
-                  <w:szCs w:val="14"/>
-                  <w:u w:val="none"/>
-                </w:rPr>
-                <w:t>nyksm.s.liquid-a@nykgroup.com</w:t>
-              </w:r>
-            </w:hyperlink>
-            <w:hyperlink r:id="rId14" w:tgtFrame="_blank" w:history="1">
-              <w:r>
-                <w:rPr>
-                  <w:rStyle w:val="Hipervnculo"/>
-                  <w:rFonts w:ascii="Arial" w:hAnsi="Arial" w:cs="Arial"/>
-                  <w:color w:val="000000" w:themeColor="text1"/>
-                  <w:sz w:val="14"/>
-                  <w:szCs w:val="14"/>
-                  <w:u w:val="none"/>
-                </w:rPr>
-                <w:t>pranav.sinha@nykgroup.com</w:t>
-              </w:r>
-            </w:hyperlink>
-            <w:hyperlink r:id="rId15" w:tgtFrame="_blank" w:history="1">
-              <w:r>
-                <w:rPr>
-                  <w:rStyle w:val="Hipervnculo"/>
-                  <w:rFonts w:ascii="Arial" w:hAnsi="Arial" w:cs="Arial"/>
-                  <w:color w:val="000000" w:themeColor="text1"/>
-                  <w:sz w:val="14"/>
-                  <w:szCs w:val="14"/>
-                  <w:u w:val="none"/>
-                </w:rPr>
-                <w:t>julian.yeo@nykgroup.com</w:t>
-              </w:r>
-            </w:hyperlink>
-            <w:hyperlink r:id="rId16" w:tgtFrame="_blank" w:history="1">
-              <w:r>
-                <w:rPr>
-                  <w:rStyle w:val="Hipervnculo"/>
-                  <w:rFonts w:ascii="Arial" w:hAnsi="Arial" w:cs="Arial"/>
-                  <w:color w:val="000000" w:themeColor="text1"/>
-                  <w:sz w:val="14"/>
-                  <w:szCs w:val="14"/>
-                  <w:u w:val="none"/>
-                </w:rPr>
-                <w:t>nyksm.s.ict@nykgroup.com</w:t>
-              </w:r>
-            </w:hyperlink>
-            <w:hyperlink r:id="rId17" w:tgtFrame="_blank" w:history="1">
-              <w:r>
-                <w:rPr>
-                  <w:rStyle w:val="Hipervnculo"/>
-                  <w:rFonts w:ascii="Arial" w:hAnsi="Arial" w:cs="Arial"/>
-                  <w:color w:val="000000" w:themeColor="text1"/>
-                  <w:sz w:val="14"/>
-                  <w:szCs w:val="14"/>
-                  <w:u w:val="none"/>
-                </w:rPr>
-                <w:t>opsmgrnavieramar@protonmail.com</w:t>
-              </w:r>
-            </w:hyperlink>
+            <w:r>
+              <w:rPr>
+                <w:rFonts w:ascii="Arial" w:hAnsi="Arial" w:cs="Arial"/>
+                <w:color w:val="000000" w:themeColor="text1"/>
+                <w:sz w:val="14"/>
+                <w:szCs w:val="14"/>
+                <w:u w:val="none"/>
+              </w:rPr>
+              <w:t>{firstMessage}</w:t>
+            </w:r>
           </w:p>
         </w:tc>
       </w:tr>
@@ -965,58 +844,16 @@
                 <w:szCs w:val="14"/>
               </w:rPr>
             </w:pPr>
-            <w:hyperlink r:id="rId19" w:history="1">
-              <w:r>
-                <w:rPr>
-                  <w:rStyle w:val="Hipervnculo"/>
-                  <w:rFonts w:ascii="Arial" w:hAnsi="Arial" w:cs="Arial"/>
-                  <w:color w:val="000000" w:themeColor="text1"/>
-                  <w:sz w:val="16"/>
-                  <w:szCs w:val="16"/>
-                  <w:u w:val="none"/>
-                </w:rPr>
-                <w:t xml:space="preserve">{secondMessage}</w:t>
-              </w:r>
-            </w:hyperlink>
-            <w:hyperlink r:id="rId20" w:history="1">
-              <w:r>
-                <w:rPr>
-                  <w:rStyle w:val="Hipervnculo"/>
-                  <w:rFonts w:ascii="Arial" w:hAnsi="Arial" w:cs="Arial"/>
-                  <w:color w:val="000000" w:themeColor="text1"/>
-                  <w:sz w:val="16"/>
-                  <w:szCs w:val="16"/>
-                  <w:u w:val="none"/>
-                </w:rPr>
-                <w:t>naylin.tata@ril.com</w:t>
-              </w:r>
-            </w:hyperlink>
-            <w:hyperlink r:id="rId21" w:history="1">
-              <w:r>
-                <w:rPr>
-                  <w:rStyle w:val="Hipervnculo"/>
-                  <w:rFonts w:ascii="Arial" w:hAnsi="Arial" w:cs="Arial"/>
-                  <w:color w:val="000000" w:themeColor="text1"/>
-                  <w:sz w:val="16"/>
-                  <w:szCs w:val="16"/>
-                  <w:u w:val="none"/>
-                </w:rPr>
-                <w:t>prakhar.galgale@ril.com</w:t>
-              </w:r>
-            </w:hyperlink>
-            <w:hyperlink r:id="rId22" w:history="1">
-              <w:r>
-                <w:rPr>
-                  <w:rStyle w:val="Hipervnculo"/>
-                  <w:rFonts w:ascii="Arial" w:hAnsi="Arial" w:cs="Arial"/>
-                  <w:color w:val="000000" w:themeColor="text1"/>
-                  <w:sz w:val="16"/>
-                  <w:szCs w:val="16"/>
-                  <w:u w:val="none"/>
-                </w:rPr>
-                <w:t>manalkumar.g@ril.com</w:t>
-              </w:r>
-            </w:hyperlink>
+            <w:r>
+              <w:rPr>
+                <w:rFonts w:ascii="Arial" w:hAnsi="Arial" w:cs="Arial"/>
+                <w:color w:val="000000" w:themeColor="text1"/>
+                <w:sz w:val="16"/>
+                <w:szCs w:val="16"/>
+                <w:u w:val="none"/>
+              </w:rPr>
+              <w:t>{secondMessage}</w:t>
+            </w:r>
           </w:p>
         </w:tc>
       </w:tr>
@@ -1653,8 +1490,10 @@
                 <w:rFonts w:ascii="Arial" w:hAnsi="Arial" w:cs="Arial"/>
                 <w:sz w:val="14"/>
                 <w:szCs w:val="14"/>
-              </w:rPr>
-              <w:t xml:space="preserve">{thirdMessage}</w:t>
+                <w:color w:val="000000"/>
+                <w:u w:val="none"/>
+              </w:rPr>
+              <w:t>{thirdMessage}</w:t>
             </w:r>
           </w:p>
         </w:tc>
@@ -2269,30 +2108,15 @@
                 <w:szCs w:val="16"/>
               </w:rPr>
             </w:pPr>
-            <w:hyperlink r:id="rId23" w:history="1">
-              <w:r>
-                <w:rPr>
-                  <w:rStyle w:val="Hipervnculo"/>
-                  <w:color w:val="000000" w:themeColor="text1"/>
-                  <w:sz w:val="16"/>
-                  <w:szCs w:val="16"/>
-                  <w:u w:val="none"/>
-                </w:rPr>
-                <w:t xml:space="preserve">{ccMessage}</w:t>
-              </w:r>
-            </w:hyperlink>
-            <w:hyperlink r:id="rId24" w:history="1">
-              <w:r>
-                <w:rPr>
-                  <w:rStyle w:val="Hipervnculo"/>
-                  <w:color w:val="000000" w:themeColor="text1"/>
-                  <w:sz w:val="16"/>
-                  <w:szCs w:val="16"/>
-                  <w:u w:val="none"/>
-                </w:rPr>
-                <w:t>dimitri@navieramar.com</w:t>
-              </w:r>
-            </w:hyperlink>
+            <w:r>
+              <w:rPr>
+                <w:color w:val="000000" w:themeColor="text1"/>
+                <w:sz w:val="16"/>
+                <w:szCs w:val="16"/>
+                <w:u w:val="none"/>
+              </w:rPr>
+              <w:t>{ccMessage}</w:t>
+            </w:r>
           </w:p>
         </w:tc>
       </w:tr>
@@ -2590,7 +2414,6 @@
     <w:tbl>
       <w:tblPr>
         <w:tblStyle w:val="Tablaconcuadrcula"/>
-        <w:tblpPr w:leftFromText="141" w:rightFromText="141" w:vertAnchor="text" w:horzAnchor="margin" w:tblpXSpec="center" w:tblpYSpec="center"/>
         <w:tblW w:w="10201" w:type="dxa"/>
         <w:tblLayout w:type="fixed"/>
         <w:tblLook w:val="04A0" w:firstRow="1" w:lastRow="0" w:firstColumn="1" w:lastColumn="0" w:noHBand="0" w:noVBand="1"/>

</xml_diff>